<commit_message>
Ho kinh doanh, ho so thay doi, ho so sau thanh lap, gop file PDF
</commit_message>
<xml_diff>
--- a/public/mau/Mau_ThayDoi_MailMerge.docx
+++ b/public/mau/Mau_ThayDoi_MailMerge.docx
@@ -4422,6 +4422,20 @@
     </w:p>
     <w:p>
       <w:pPr>
+        <w:spacing w:before="120" w:after="240" w:line="276" w:lineRule="auto"/>
+        <w:ind w:firstLine="709"/>
+        <w:jc w:val="center"/>
+        <w:rPr>
+          <w:sz w:val="28"/>
+          <w:szCs w:val="28"/>
+        </w:rPr>
+      </w:pPr>
+      <w:r>
+        <w:t>[[^TEN_MOI_TA]]</w:t>
+      </w:r>
+    </w:p>
+    <w:p>
+      <w:pPr>
         <w:tabs>
           <w:tab w:val="left" w:leader="dot" w:pos="9072"/>
         </w:tabs>
@@ -4439,6 +4453,20 @@
           <w:szCs w:val="28"/>
         </w:rPr>
         <w:tab/>
+      </w:r>
+    </w:p>
+    <w:p>
+      <w:pPr>
+        <w:spacing w:before="120" w:after="240" w:line="276" w:lineRule="auto"/>
+        <w:ind w:firstLine="709"/>
+        <w:jc w:val="center"/>
+        <w:rPr>
+          <w:sz w:val="28"/>
+          <w:szCs w:val="28"/>
+        </w:rPr>
+      </w:pPr>
+      <w:r>
+        <w:t>[[/TEN_MOI_TA]]</w:t>
       </w:r>
     </w:p>
     <w:p>
@@ -4474,6 +4502,20 @@
     </w:p>
     <w:p>
       <w:pPr>
+        <w:spacing w:before="120" w:after="240" w:line="276" w:lineRule="auto"/>
+        <w:ind w:firstLine="709"/>
+        <w:jc w:val="center"/>
+        <w:rPr>
+          <w:sz w:val="28"/>
+          <w:szCs w:val="28"/>
+        </w:rPr>
+      </w:pPr>
+      <w:r>
+        <w:t>[[^TEN_MOI_VT]]</w:t>
+      </w:r>
+    </w:p>
+    <w:p>
+      <w:pPr>
         <w:tabs>
           <w:tab w:val="left" w:leader="dot" w:pos="9072"/>
         </w:tabs>
@@ -4491,6 +4533,20 @@
           <w:szCs w:val="28"/>
         </w:rPr>
         <w:tab/>
+      </w:r>
+    </w:p>
+    <w:p>
+      <w:pPr>
+        <w:spacing w:before="120" w:after="240" w:line="276" w:lineRule="auto"/>
+        <w:ind w:firstLine="709"/>
+        <w:jc w:val="center"/>
+        <w:rPr>
+          <w:sz w:val="28"/>
+          <w:szCs w:val="28"/>
+        </w:rPr>
+      </w:pPr>
+      <w:r>
+        <w:t>[[/TEN_MOI_VT]]</w:t>
       </w:r>
     </w:p>
     <w:p>
@@ -32075,7 +32131,7 @@
         </w:rPr>
       </w:pPr>
       <w:r>
-        <w:t xml:space="preserve">[[#TD_CHU_SO_HUU]]</w:t>
+        <w:t xml:space="preserve">[[#TB_HL]]</w:t>
       </w:r>
     </w:p>
     <w:p>
@@ -32098,11 +32154,21 @@
     </w:p>
     <w:p>
       <w:pPr>
+        <w:spacing w:before="120" w:after="240" w:line="276" w:lineRule="auto"/>
+        <w:ind w:firstLine="709"/>
+        <w:jc w:val="center"/>
+        <w:rPr>
+          <w:sz w:val="28"/>
+          <w:szCs w:val="28"/>
+        </w:rPr>
+      </w:pPr>
+      <w:r>
+        <w:t>[[#TB_HL_A]]</w:t>
+      </w:r>
+    </w:p>
+    <w:p>
+      <w:pPr>
         <w:pStyle w:val="ListParagraph"/>
-        <w:numPr>
-          <w:ilvl w:val="0"/>
-          <w:numId w:val="1"/>
-        </w:numPr>
         <w:spacing w:before="120" w:after="120" w:line="300" w:lineRule="exact"/>
         <w:ind w:left="0" w:firstLine="567"/>
         <w:contextualSpacing w:val="0"/>
@@ -32119,6 +32185,14 @@
           <w:szCs w:val="28"/>
           <w:lang w:val="vi-VN"/>
         </w:rPr>
+        <w:t xml:space="preserve">a) </w:t>
+      </w:r>
+      <w:r>
+        <w:rPr>
+          <w:sz w:val="28"/>
+          <w:szCs w:val="28"/>
+          <w:lang w:val="vi-VN"/>
+        </w:rPr>
         <w:t xml:space="preserve">Trường hợp doanh nghiệp có sự thay đổi </w:t>
       </w:r>
       <w:proofErr w:type="spellStart"/>
@@ -32593,15 +32667,39 @@
           <w:szCs w:val="28"/>
         </w:rPr>
         <w:t>.</w:t>
+      </w:r>
+    </w:p>
+    <w:p>
+      <w:pPr>
+        <w:spacing w:before="120" w:after="240" w:line="276" w:lineRule="auto"/>
+        <w:ind w:firstLine="709"/>
+        <w:jc w:val="center"/>
+        <w:rPr>
+          <w:sz w:val="28"/>
+          <w:szCs w:val="28"/>
+        </w:rPr>
+      </w:pPr>
+      <w:r>
+        <w:t>[[/TB_HL_A]]</w:t>
+      </w:r>
+    </w:p>
+    <w:p>
+      <w:pPr>
+        <w:spacing w:before="120" w:after="240" w:line="276" w:lineRule="auto"/>
+        <w:ind w:firstLine="709"/>
+        <w:jc w:val="center"/>
+        <w:rPr>
+          <w:sz w:val="28"/>
+          <w:szCs w:val="28"/>
+        </w:rPr>
+      </w:pPr>
+      <w:r>
+        <w:t>[[#TB_HL_B]]</w:t>
       </w:r>
     </w:p>
     <w:p>
       <w:pPr>
         <w:pStyle w:val="ListParagraph"/>
-        <w:numPr>
-          <w:ilvl w:val="0"/>
-          <w:numId w:val="1"/>
-        </w:numPr>
         <w:spacing w:before="120" w:after="120" w:line="300" w:lineRule="exact"/>
         <w:ind w:left="0" w:firstLine="567"/>
         <w:contextualSpacing w:val="0"/>
@@ -32618,6 +32716,14 @@
           <w:szCs w:val="28"/>
           <w:lang w:val="vi-VN"/>
         </w:rPr>
+        <w:t xml:space="preserve">b) </w:t>
+      </w:r>
+      <w:r>
+        <w:rPr>
+          <w:sz w:val="28"/>
+          <w:szCs w:val="28"/>
+          <w:lang w:val="vi-VN"/>
+        </w:rPr>
         <w:t>Đối với doanh nghiệp được thành lập trước ngày 01/7/2025, doanh nghiệp bổ sung thông tin về chủ sở hữu hưởng lợi của doanh nghiệp theo quy định tại khoản 1 Điều 3 Luật số 76/2025/QH15 ngày 17/6/2025 sửa đổi, bổ sung một số điều của Luật Doanh nghiệp (</w:t>
       </w:r>
       <w:r>
@@ -32655,6 +32761,20 @@
           <w:lang w:val="vi-VN"/>
         </w:rPr>
         <w:t>.</w:t>
+      </w:r>
+    </w:p>
+    <w:p>
+      <w:pPr>
+        <w:spacing w:before="120" w:after="240" w:line="276" w:lineRule="auto"/>
+        <w:ind w:firstLine="709"/>
+        <w:jc w:val="center"/>
+        <w:rPr>
+          <w:sz w:val="28"/>
+          <w:szCs w:val="28"/>
+        </w:rPr>
+      </w:pPr>
+      <w:r>
+        <w:t>[[/TB_HL_B]]</w:t>
       </w:r>
     </w:p>
     <w:p>
@@ -32680,7 +32800,7 @@
         </w:rPr>
       </w:pPr>
       <w:r>
-        <w:t xml:space="preserve">[[/TD_CHU_SO_HUU]]</w:t>
+        <w:t xml:space="preserve">[[/TB_HL]]</w:t>
       </w:r>
     </w:p>
     <w:p>
@@ -33772,8 +33892,7 @@
           </w:p>
           <w:p>
             <w:pPr>
-              <w:ind w:left="720"/>
-              <w:jc w:val="both"/>
+              <w:jc w:val="center"/>
               <w:rPr>
                 <w:rFonts w:eastAsia="Times New Roman"/>
                 <w:sz w:val="26"/>

</xml_diff>